<commit_message>
Instructor interface: new sensor tiles, Pulse and Comps indicators
</commit_message>
<xml_diff>
--- a/Open_VetSim_Scenario_XML_V1.12.docx
+++ b/Open_VetSim_Scenario_XML_V1.12.docx
@@ -4546,7 +4546,7 @@
           <w:b/>
           <w:sz w:val="28"/>
         </w:rPr>
-        <w:t>Corrected the profile button list – the NIBP cuff button id is button-bpcuff, not button-cuff. Added button-pac and button-abp, renamed the Palpate and CPR buttons Pulse and Comps, and documented the sensor-button row: &lt;top&gt; and &lt;left&gt; no longer apply to the seven sensor buttons.</w:t>
+        <w:t>Corrected the profile button list – the NIBP cuff button id is button-bpcuff, not button-cuff. Added button-pac and button-abp, renamed the Palpate and CPR buttons Pulse and Comps, labelled button-pac “IBP2”, and documented the sensor-button row: &lt;top&gt; and &lt;left&gt; no longer apply to the seven sensor buttons.</w:t>
       </w:r>
     </w:p>
     <w:p>
@@ -7809,7 +7809,7 @@
         </w:numPr>
       </w:pPr>
       <w:r>
-        <w:t>PA Catheter (id: button-pac) – when clicked this button places or removes a pulmonary artery (Swan-Ganz) catheter.  Placing one adds the PA catheter waveform to the patient monitor; removing it takes the waveform away and the remaining waveforms expand to fill the space.</w:t>
+        <w:t>IBP2 (id: button-pac) – when clicked this button places or removes a second invasive pressure catheter, used for central venous (CVP) or pulmonary artery monitoring; where the tip sits is set with cardiac:pac_position.  Placing one adds the IBP2 waveform to the patient monitor; removing it takes the waveform away and the remaining waveforms expand to fill the space.  Shown only when the app’s Simulator ▸ Patient Monitor setting is Advanced.</w:t>
       </w:r>
       <w:proofErr w:type="spellStart"/>
       <w:proofErr w:type="spellEnd"/>
@@ -7825,7 +7825,7 @@
         </w:numPr>
       </w:pPr>
       <w:r>
-        <w:t>ABP (id: button-abp) – when clicked this button places or removes a direct (invasive) arterial line.  Placing one adds the arterial pressure waveform, with its systolic, diastolic and mean pressures, to the patient monitor; removing it takes the waveform away and the remaining waveforms expand to fill the space.  It sets the same value as cardiac:abp_line.</w:t>
+        <w:t>ABP (id: button-abp) – when clicked this button places or removes a direct (invasive) arterial line.  Placing one adds the arterial pressure waveform, with its systolic, diastolic and mean pressures, to the patient monitor; removing it takes the waveform away and the remaining waveforms expand to fill the space.  It sets the same value as cardiac:abp_line.  Shown only when the app’s Simulator ▸ Patient Monitor setting is Advanced.</w:t>
       </w:r>
       <w:proofErr w:type="spellStart"/>
       <w:proofErr w:type="spellEnd"/>
@@ -7875,7 +7875,7 @@
         <w:rPr>
           <w:b/>
         </w:rPr>
-        <w:t>NOTE:    Pulse and Comps are placed on the avatar by the &lt;top&gt; and &lt;left&gt; of their &lt;control&gt; entries, as the controls are.  The seven sensor buttons – ECG, SpO2, Temp, PA Catheter, ABP, ETCO2 and Cuff – are laid out by the instructor interface in a fixed row beneath the avatar, in that order.  Their &lt;control&gt; entries still set each button's label through &lt;title&gt;, but &lt;top&gt; and &lt;left&gt; are ignored.  A sensor button with no &lt;control&gt; entry still appears, with its default label.</w:t>
+        <w:t>NOTE:    Pulse and Comps are placed on the avatar by the &lt;top&gt; and &lt;left&gt; of their &lt;control&gt; entries, as the controls are.  The seven sensor buttons – ECG, SpO2, ETCO2, NIBP (button-bpcuff), Temp, ABP and IBP2 – are laid out by the instructor interface in a fixed row beneath the avatar, in that order, each a tile that names itself (ECG, SpO2, ETCO2, NIBP, T°, ABP, IBP2).  Their &lt;control&gt; entries set each button's tooltip through &lt;title&gt;; &lt;top&gt; and &lt;left&gt; are ignored.  Pulse and Comps are pictures without a visible label, placed by &lt;top&gt; and &lt;left&gt; as before.  A sensor button with no &lt;control&gt; entry still appears, with its default label.  When the app’s Simulator ▸ Patient Monitor setting is Simple (the default), the IBP2 and ABP buttons are hidden and their waveforms are not shown, whatever the scenario sets; the monitor shows ECG, ETCO2 and SpO2 only.</w:t>
       </w:r>
     </w:p>
     <w:p>
@@ -22094,7 +22094,7 @@
               <w:pStyle w:val="PropNormal"/>
             </w:pPr>
             <w:r>
-              <w:t>PA catheter placed, 0 or 1.</w:t>
+              <w:t>IBP2 catheter placed, 0 or 1.</w:t>
             </w:r>
           </w:p>
         </w:tc>

</xml_diff>